<commit_message>
court(ark): reply-brief gated on the shared model, conclusion kept with the signature (fb-595.54.28)
Co-Authored-By: Claude Opus 5.5 <noreply@anthropic.com>
</commit_message>
<xml_diff>
--- a/courts/eighth-circuit/arkansas/state/supreme-court/reply-brief/usage/OUTPUT-reply-brief.docx
+++ b/courts/eighth-circuit/arkansas/state/supreme-court/reply-brief/usage/OUTPUT-reply-brief.docx
@@ -845,7 +845,7 @@
         <w:tab/>
       </w:r>
       <w:r>
-        <w:t xml:space="preserve">17</w:t>
+        <w:t xml:space="preserve">18</w:t>
       </w:r>
     </w:p>
     <w:p>
@@ -4030,7 +4030,7 @@
         <w:t xml:space="preserve"> </w:t>
       </w:r>
       <w:r>
-        <w:t xml:space="preserve">v. Jones, 257 Ark. 210, 213, 515 S.W.2d 201, 203 (1974) (legislature’s observance of its procedures is “not subject to . . . review[] by the courts”).</w:t>
+        <w:t xml:space="preserve">v. Jones, 257 Ark. 210, 213, 515 S.W.2d 201, 203 (1974) (legislature’s observance of its procedures is “not subject to . . . review[] by the courts”).</w:t>
       </w:r>
     </w:p>
     <w:p>
@@ -4358,7 +4358,7 @@
         <w:pStyle w:val="BodyText"/>
       </w:pPr>
       <w:r>
-        <w:t xml:space="preserve">If this Court doesn’t resolve this case based on the political-question doctrine, it should hold LEARNS’s emergency clause is valid. Our Constitution requires that to adopt an emergency clause, “two-thirds of all the members elected to each house . . . shall vote upon separate roll call in favor.” Ark. Const. art. 5, sec. 1.</w:t>
+        <w:t xml:space="preserve">If this Court doesn’t resolve this case based on the political-question doctrine, it should hold LEARNS’s emergency clause is valid. Our Constitution requires that to adopt an emergency clause, “two-thirds of all the members elected to each house . . . shall vote upon separate roll call in favor.” Ark. Const. art. 5, sec. 1.</w:t>
       </w:r>
       <w:r>
         <w:t xml:space="preserve"> </w:t>
@@ -4912,7 +4912,7 @@
         <w:pStyle w:val="BodyText"/>
       </w:pPr>
       <w:r>
-        <w:t xml:space="preserve">Applying that standard, the circuit court’s order declaring LEARNS’s emergency clause invalid is final and appealable. That order ended the dispute between the parties, and it didn’t contemplate any further action by the parties on the alternative theories that it didn’t reach. (RP 243); see also (RP 240) (ordering that “all provisions of the Act purported to be immediately effective due to the invalid clause are now effective as of . . . August 1” (emphasis added)). Yet Plaintiffs claim that wasn’t really a final order because the circuit court didn’t reach their alternative theories for invalidating the emergency clause—including whether it “fails to state an emergency” and whether the General Assembly may “declare an emergency as to only specific parts of the bill.” Pls.’ Br. 12</w:t>
+        <w:t xml:space="preserve">Applying that standard, the circuit court’s order declaring LEARNS’s emergency clause invalid is final and appealable. That order ended the dispute between the parties, and it didn’t contemplate any further action by the parties on the alternative theories that it didn’t reach. (RP 243); see also (RP 240) (ordering that “all provisions of the Act purported to be immediately effective due to the invalid clause are now effective as of . . . August 1” (emphasis added)). Yet Plaintiffs claim that wasn’t really a final order because the circuit court didn’t reach their alternative theories for invalidating the emergency clause—including whether it “fails to state an emergency” and whether the General Assembly may “declare an emergency as to only specific parts of the bill.” Pls.’ Br. 12</w:t>
       </w:r>
       <w:r>
         <w:noBreakHyphen/>
@@ -4926,7 +4926,7 @@
         <w:pStyle w:val="BodyText"/>
       </w:pPr>
       <w:r>
-        <w:t xml:space="preserve">But as the circuit court explained, it “need not determine” the merits of Plaintiffs’ other theories because its decision on the separate roll-call vote argument fully resolved Plaintiffs’ declaratory-judgment claim and gave them the relief they sought. (RP 241). And Plaintiffs unsurprisingly didn’t press for a ruling on those alternative theories because, as they concede, “[a]ll” of their “claims hinge[d] exclusively on the effective date of” LEARNS. Pls.’ Br. 14. So when the circuit court held LEARNS wasn’t effective until August 1, that resolved all their outstanding claims, and this case became appealable. See Robinson, 2012 Ark. at 2 (where order doesn’t “contemplate[] further action by . . . the court”, it’s final and appealable). This Court has jurisdiction to review that final order and should do so.</w:t>
+        <w:t xml:space="preserve">But as the circuit court explained, it “need not determine” the merits of Plaintiffs’ other theories because its decision on the separate roll-call vote argument fully resolved Plaintiffs’ declaratory-judgment claim and gave them the relief they sought. (RP 241). And Plaintiffs unsurprisingly didn’t press for a ruling on those alternative theories because, as they concede, “[a]ll” of their “claims hinge[d] exclusively on the effective date of” LEARNS. Pls.’ Br. 14. So when the circuit court held LEARNS wasn’t effective until August 1, that resolved all their outstanding claims, and this case became appealable. See Robinson, 2012 Ark. at 2 (where order doesn’t “contemplate[] further action by . . . the court”, it’s final and appealable). This Court has jurisdiction to review that final order and should do so.</w:t>
       </w:r>
     </w:p>
     <w:p>
@@ -5159,7 +5159,7 @@
     </w:p>
     <w:p>
       <w:pPr>
-        <w:pStyle w:val="BodyText"/>
+        <w:pStyle w:val="BodyTextKeep"/>
       </w:pPr>
       <w:r>
         <w:t xml:space="preserve">For these reasons, this Court should reverse the circuit court’s order and dismiss this case.</w:t>
@@ -5167,6 +5167,8 @@
     </w:p>
     <w:p>
       <w:pPr>
+        <w:keepNext/>
+        <w:keepLines/>
         <w:spacing w:before="0" w:after="0" w:line="576" w:lineRule="exact"/>
       </w:pPr>
     </w:p>
@@ -6713,6 +6715,15 @@
       <w:ind w:firstLine="720"/>
     </w:pPr>
   </w:style>
+  <w:style w:type="paragraph" w:customStyle="1" w:styleId="BodyTextKeep">
+    <w:name w:val="Body Text Keep"/>
+    <w:basedOn w:val="BodyText"/>
+    <w:qFormat/>
+    <w:pPr>
+      <w:keepNext/>
+      <w:keepLines/>
+    </w:pPr>
+  </w:style>
   <w:style w:type="paragraph" w:customStyle="1" w:styleId="XdList1">
     <w:name w:val="XdList 1"/>
     <w:basedOn w:val="Normal"/>
@@ -6765,6 +6776,33 @@
     <w:pPr>
       <w:spacing w:before="0" w:after="0" w:line="644" w:lineRule="exact"/>
       <w:ind w:left="2160" w:hanging="720"/>
+    </w:pPr>
+  </w:style>
+  <w:style w:type="paragraph" w:customStyle="1" w:styleId="XdQuoteList1">
+    <w:name w:val="Xd Quote List 1"/>
+    <w:basedOn w:val="Normal"/>
+    <w:qFormat/>
+    <w:pPr>
+      <w:spacing w:before="0" w:after="0" w:line="322" w:lineRule="exact"/>
+      <w:ind w:left="1440" w:right="720" w:hanging="720"/>
+    </w:pPr>
+  </w:style>
+  <w:style w:type="paragraph" w:customStyle="1" w:styleId="XdQuoteList2">
+    <w:name w:val="Xd Quote List 2"/>
+    <w:basedOn w:val="Normal"/>
+    <w:qFormat/>
+    <w:pPr>
+      <w:spacing w:before="0" w:after="0" w:line="322" w:lineRule="exact"/>
+      <w:ind w:left="2160" w:right="720" w:hanging="720"/>
+    </w:pPr>
+  </w:style>
+  <w:style w:type="paragraph" w:customStyle="1" w:styleId="XdQuoteList3">
+    <w:name w:val="Xd Quote List 3"/>
+    <w:basedOn w:val="Normal"/>
+    <w:qFormat/>
+    <w:pPr>
+      <w:spacing w:before="0" w:after="0" w:line="322" w:lineRule="exact"/>
+      <w:ind w:left="2880" w:right="720" w:hanging="720"/>
     </w:pPr>
   </w:style>
   <w:style w:type="paragraph" w:customStyle="1" w:styleId="XdTail">

</xml_diff>